<commit_message>
Finalize Deeptime RoC Analysis v1.0.1 public release
</commit_message>
<xml_diff>
--- a/docs/Deeptime_RoC_Analysis_Windows_User_Manual_v1.0.1.docx
+++ b/docs/Deeptime_RoC_Analysis_Windows_User_Manual_v1.0.1.docx
@@ -185,6 +185,11 @@
           <w:szCs w:val="24"/>
         </w:rPr>
         <w:t>Applicable version: v1.0.1</w:t>
+        <w:br/>
+        <w:t>Platform: Windows</w:t>
+        <w:br/>
+        <w:t>Document date: 2026-08-31</w:t>
+        <w:br/>
       </w:r>
       <w:r>
         <w:rPr>
@@ -194,7 +199,6 @@
           <w:sz w:val="24"/>
           <w:szCs w:val="24"/>
         </w:rPr>
-        <w:br w:type="textWrapping"/>
       </w:r>
       <w:r>
         <w:rPr>
@@ -204,7 +208,6 @@
           <w:sz w:val="24"/>
           <w:szCs w:val="24"/>
         </w:rPr>
-        <w:t>Platform: Windows</w:t>
       </w:r>
       <w:r>
         <w:rPr>
@@ -214,7 +217,6 @@
           <w:sz w:val="24"/>
           <w:szCs w:val="24"/>
         </w:rPr>
-        <w:br w:type="textWrapping"/>
       </w:r>
       <w:r>
         <w:rPr>
@@ -224,14 +226,12 @@
           <w:sz w:val="24"/>
           <w:szCs w:val="24"/>
         </w:rPr>
-        <w:t>Document date: 2026-06-12</w:t>
       </w:r>
       <w:r>
         <w:rPr>
           <w:rFonts w:hint="eastAsia" w:ascii="微软雅黑" w:hAnsi="微软雅黑" w:eastAsia="微软雅黑" w:cs="微软雅黑"/>
           <w:szCs w:val="24"/>
         </w:rPr>
-        <w:br w:type="textWrapping"/>
       </w:r>
     </w:p>
     <w:p>
@@ -273,6 +273,7 @@
         </w:rPr>
         <w:sectPr>
           <w:footerReference r:id="rId5" w:type="default"/>
+          <w:headerReference w:type="default" r:id="rId17"/>
           <w:pgSz w:w="11906" w:h="16838"/>
           <w:pgMar w:top="1440" w:right="1800" w:bottom="1440" w:left="1800" w:header="851" w:footer="992" w:gutter="0"/>
           <w:pgNumType w:fmt="decimal"/>
@@ -2277,7 +2278,7 @@
           <w:footerReference r:id="rId6" w:type="default"/>
           <w:pgSz w:w="11906" w:h="16838"/>
           <w:pgMar w:top="1440" w:right="1800" w:bottom="1440" w:left="1800" w:header="851" w:footer="992" w:gutter="0"/>
-          <w:pgNumType w:fmt="decimal" w:start="1"/>
+          <w:pgNumType w:fmt="decimal"/>
           <w:cols w:space="425" w:num="1"/>
           <w:docGrid w:type="lines" w:linePitch="312" w:charSpace="0"/>
         </w:sectPr>
@@ -2331,16 +2332,15 @@
           <w:sz w:val="24"/>
           <w:szCs w:val="24"/>
         </w:rPr>
-        <w:t xml:space="preserve">RoC Workflow is a multi-timescale rate-of-change (RoC) analysis software package designed for deep-time palaeoclimate time series. The Windows version is packaged as an executable, so users do not need to install Python or open a terminal. Double-click RoC_Workflow.exe to launch the graphical user interface. For the source-code version or instructions for running on macOS, </w:t>
-      </w:r>
-      <w:r>
-        <w:rPr>
-          <w:rFonts w:hint="default"/>
-          <w:sz w:val="24"/>
-          <w:szCs w:val="24"/>
-          <w:lang w:val="en-US" w:eastAsia="zh-CN"/>
-        </w:rPr>
-        <w:t>please contact the developers.</w:t>
+        <w:t>Deeptime RoC Analysis is a multi-timescale rate-of-change (RoC) analysis software package designed for deep-time palaeoclimate time series. The Windows version is packaged as an executable, so users do not need to install Python or open a terminal. Double-click RoC_Workflow.exe to launch the graphical user interface. The Python source code and launchers for Windows and macOS are available in the public GitHub repository.</w:t>
+      </w:r>
+      <w:r>
+        <w:rPr>
+          <w:rFonts w:hint="default"/>
+          <w:sz w:val="24"/>
+          <w:szCs w:val="24"/>
+          <w:lang w:val="en-US" w:eastAsia="zh-CN"/>
+        </w:rPr>
       </w:r>
     </w:p>
     <w:p>
@@ -2908,7 +2908,7 @@
                 <w:rFonts w:hint="default" w:ascii="Times New Roman" w:hAnsi="Times New Roman" w:eastAsia="仿宋" w:cs="Times New Roman"/>
                 <w:sz w:val="19"/>
               </w:rPr>
-              <w:t>Default test configuration file for a quick standard run.</w:t>
+              <w:t>Fast installation and workflow-verification configuration; it is not the manuscript parameter record.</w:t>
             </w:r>
           </w:p>
         </w:tc>
@@ -3001,7 +3001,7 @@
                 <w:rFonts w:hint="default" w:ascii="Times New Roman" w:hAnsi="Times New Roman" w:eastAsia="仿宋" w:cs="Times New Roman"/>
                 <w:sz w:val="19"/>
               </w:rPr>
-              <w:t>Full configuration file for reproducing the parameter settings used in the associated paper as closely as possible.</w:t>
+              <w:t>Complete configuration containing the exact analysis parameter settings used for the associated manuscript.</w:t>
             </w:r>
           </w:p>
         </w:tc>
@@ -3607,7 +3607,7 @@
           <w:szCs w:val="24"/>
           <w:lang w:val="en-US" w:eastAsia="zh-CN"/>
         </w:rPr>
-        <w:t>Extract RoC_Workflow_Windows_v1.0.1_20260612.zip.</w:t>
+        <w:t>Extract RoC_Workflow_Windows_v1.0.1.zip.</w:t>
       </w:r>
     </w:p>
     <w:p>
@@ -4093,7 +4093,7 @@
           <w:szCs w:val="24"/>
           <w:lang w:val="en-US" w:eastAsia="zh-CN"/>
         </w:rPr>
-        <w:t>The RoC Workflow GUI contains five pages: 1. Input Data, 2. RoC Settings, 3. Advanced Analysis, 4. Run &amp; Log, and 5. Results Preview. Use the tabs at the top to switch between pages, or use the Previous step / Next step buttons at the bottom to move through the workflow.</w:t>
+        <w:t>The Deeptime RoC Analysis GUI contains five pages: 1. Input Data, 2. RoC Settings, 3. Advanced Analysis, 4. Run &amp; Log, and 5. Results Preview. Use the tabs at the top to switch between pages, or use the Previous step / Next step buttons at the bottom to move through the workflow.</w:t>
       </w:r>
     </w:p>
     <w:p>
@@ -4397,7 +4397,7 @@
           <w:szCs w:val="24"/>
           <w:lang w:val="en-US" w:eastAsia="zh-CN"/>
         </w:rPr>
-        <w:t>Use Z-score normalized values for RoC analysis: Specifies whether to convert the values in the Value column to Z-scores before calculating RoC before calculating RoC. This is suitable for relative comparisons among different proxies.</w:t>
+        <w:t>Use Z-score normalized values for RoC analysis: Specifies whether to convert the values in the Value column to Z-scores before calculating RoC. This is suitable for relative comparisons among different proxies.</w:t>
       </w:r>
     </w:p>
     <w:p>
@@ -6038,7 +6038,7 @@
           <w:sz w:val="24"/>
           <w:szCs w:val="24"/>
         </w:rPr>
-        <w:t>RoC Workflow uses YAML configuration files to store default and advanced parameters. Parameters visible in the GUI override the corresponding settings in the base config file; advanced parameters not displayed in the GUI remain controlled by the base config file.</w:t>
+        <w:t>Deeptime RoC Analysis uses YAML configuration files to store default and advanced parameters. Parameters visible in the GUI override the corresponding settings in the base config file; advanced parameters not displayed in the GUI remain controlled by the base config file.</w:t>
       </w:r>
     </w:p>
     <w:p>
@@ -7365,7 +7365,7 @@
                 <w:rFonts w:hint="default" w:ascii="Times New Roman" w:hAnsi="Times New Roman" w:eastAsia="仿宋" w:cs="Times New Roman"/>
                 <w:sz w:val="19"/>
               </w:rPr>
-              <w:t>12_figures</w:t>
+              <w:t>figures</w:t>
             </w:r>
           </w:p>
         </w:tc>
@@ -7501,6 +7501,28 @@
                 <w:sz w:val="19"/>
               </w:rPr>
               <w:t>Summary of the parameters and output files for the current run.</w:t>
+            </w:r>
+          </w:p>
+        </w:tc>
+      </w:tr>
+      <w:tr>
+        <w:tc>
+          <w:tcPr>
+            <w:tcW w:type="dxa" w:w="2381"/>
+          </w:tcPr>
+          <w:p>
+            <w:r>
+              <w:t>logs</w:t>
+            </w:r>
+          </w:p>
+        </w:tc>
+        <w:tc>
+          <w:tcPr>
+            <w:tcW w:type="dxa" w:w="6803"/>
+          </w:tcPr>
+          <w:p>
+            <w:r>
+              <w:t>Runtime logs and diagnostic information for the current run.</w:t>
             </w:r>
           </w:p>
         </w:tc>
@@ -10205,7 +10227,7 @@
           <w:szCs w:val="24"/>
           <w:lang w:val="en-US" w:eastAsia="zh-CN"/>
         </w:rPr>
-        <w:t>When using RoC Workflow in a paper, report, or project, cite the software name, version, authors, year, and, where available, the GitHub repository URL</w:t>
+        <w:t>When using Deeptime RoC Analysis in a paper, report, or project, cite the software name, version, authors, year, and, where available, the GitHub repository URL or DOI. For the formal citation, refer to the CITATION.cff file included in the distribution package.</w:t>
       </w:r>
       <w:bookmarkStart w:id="17" w:name="_GoBack"/>
       <w:r>
@@ -10215,7 +10237,6 @@
           <w:szCs w:val="24"/>
           <w:lang w:val="en-US" w:eastAsia="zh-CN"/>
         </w:rPr>
-        <w:t xml:space="preserve"> </w:t>
       </w:r>
       <w:bookmarkEnd w:id="17"/>
       <w:r>
@@ -10225,7 +10246,6 @@
           <w:szCs w:val="24"/>
           <w:lang w:val="en-US" w:eastAsia="zh-CN"/>
         </w:rPr>
-        <w:t>or DOI. For the formal citation, refer to the CITATION.cff file included in the distribution package.</w:t>
       </w:r>
     </w:p>
     <w:p>
@@ -10503,7 +10523,7 @@
                 <w:sz w:val="19"/>
                 <w:szCs w:val="19"/>
               </w:rPr>
-              <w:t>RoC Workflow</w:t>
+              <w:t>Deeptime RoC Analysis</w:t>
             </w:r>
           </w:p>
         </w:tc>
@@ -10697,7 +10717,7 @@
                 <w:sz w:val="19"/>
                 <w:szCs w:val="19"/>
               </w:rPr>
-              <w:t>2026-06-12</w:t>
+              <w:t>2026-08-31</w:t>
             </w:r>
           </w:p>
         </w:tc>
@@ -11261,7 +11281,7 @@
       <w:footerReference r:id="rId7" w:type="default"/>
       <w:pgSz w:w="11906" w:h="16838"/>
       <w:pgMar w:top="1440" w:right="1440" w:bottom="1440" w:left="1440" w:header="851" w:footer="992" w:gutter="0"/>
-      <w:pgNumType w:fmt="decimal" w:start="1"/>
+      <w:pgNumType w:fmt="decimal"/>
       <w:cols w:space="425" w:num="1"/>
       <w:docGrid w:type="lines" w:linePitch="312" w:charSpace="0"/>
     </w:sectPr>
@@ -11314,11 +11334,26 @@
     </w:pPr>
     <w:r>
       <w:rPr>
-        <w:rFonts w:hint="eastAsia" w:ascii="微软雅黑" w:hAnsi="微软雅黑" w:eastAsia="微软雅黑" w:cs="微软雅黑"/>
+        <w:rFonts w:ascii="Segoe UI" w:hAnsi="Segoe UI"/>
         <w:color w:val="808080"/>
         <w:sz w:val="16"/>
       </w:rPr>
-      <w:t>RoC Workflow Windows User Manual · v1.0.1</w:t>
+      <w:t xml:space="preserve">Deeptime RoC Analysis Windows User Manual · v1.0.1 · </w:t>
+    </w:r>
+    <w:r>
+      <w:fldChar w:fldCharType="begin"/>
+    </w:r>
+    <w:r>
+      <w:instrText xml:space="preserve"> PAGE </w:instrText>
+    </w:r>
+    <w:r>
+      <w:fldChar w:fldCharType="separate"/>
+    </w:r>
+    <w:r>
+      <w:t>1</w:t>
+    </w:r>
+    <w:r>
+      <w:fldChar w:fldCharType="end"/>
     </w:r>
   </w:p>
   <w:p>
@@ -11378,11 +11413,26 @@
     </w:pPr>
     <w:r>
       <w:rPr>
-        <w:rFonts w:hint="eastAsia" w:ascii="微软雅黑" w:hAnsi="微软雅黑" w:eastAsia="微软雅黑" w:cs="微软雅黑"/>
+        <w:rFonts w:ascii="Segoe UI" w:hAnsi="Segoe UI"/>
         <w:color w:val="808080"/>
         <w:sz w:val="16"/>
       </w:rPr>
-      <w:t>RoC Workflow Windows User Manual · v1.0.1</w:t>
+      <w:t xml:space="preserve">Deeptime RoC Analysis Windows User Manual · v1.0.1 · </w:t>
+    </w:r>
+    <w:r>
+      <w:fldChar w:fldCharType="begin"/>
+    </w:r>
+    <w:r>
+      <w:instrText xml:space="preserve"> PAGE </w:instrText>
+    </w:r>
+    <w:r>
+      <w:fldChar w:fldCharType="separate"/>
+    </w:r>
+    <w:r>
+      <w:t>1</w:t>
+    </w:r>
+    <w:r>
+      <w:fldChar w:fldCharType="end"/>
     </w:r>
   </w:p>
 </w:ftr>
@@ -11408,131 +11458,26 @@
     </w:pPr>
     <w:r>
       <w:rPr>
-        <w:sz w:val="16"/>
-      </w:rPr>
-      <mc:AlternateContent>
-        <mc:Choice Requires="wps">
-          <w:drawing>
-            <wp:anchor distT="0" distB="0" distL="114300" distR="114300" simplePos="0" relativeHeight="251659264" behindDoc="0" locked="0" layoutInCell="1" allowOverlap="1">
-              <wp:simplePos x="0" y="0"/>
-              <wp:positionH relativeFrom="margin">
-                <wp:align>right</wp:align>
-              </wp:positionH>
-              <wp:positionV relativeFrom="paragraph">
-                <wp:posOffset>0</wp:posOffset>
-              </wp:positionV>
-              <wp:extent cx="1828800" cy="1828800"/>
-              <wp:effectExtent l="0" t="0" r="0" b="0"/>
-              <wp:wrapNone/>
-              <wp:docPr id="7" name="文本框 7"/>
-              <wp:cNvGraphicFramePr/>
-              <a:graphic xmlns:a="http://schemas.openxmlformats.org/drawingml/2006/main">
-                <a:graphicData uri="http://schemas.microsoft.com/office/word/2010/wordprocessingShape">
-                  <wps:wsp>
-                    <wps:cNvSpPr txBox="1"/>
-                    <wps:spPr>
-                      <a:xfrm>
-                        <a:off x="0" y="0"/>
-                        <a:ext cx="1828800" cy="1828800"/>
-                      </a:xfrm>
-                      <a:prstGeom prst="rect">
-                        <a:avLst/>
-                      </a:prstGeom>
-                      <a:noFill/>
-                      <a:ln w="6350">
-                        <a:noFill/>
-                      </a:ln>
-                    </wps:spPr>
-                    <wps:style>
-                      <a:lnRef idx="0">
-                        <a:schemeClr val="accent1"/>
-                      </a:lnRef>
-                      <a:fillRef idx="0">
-                        <a:schemeClr val="accent1"/>
-                      </a:fillRef>
-                      <a:effectRef idx="0">
-                        <a:schemeClr val="accent1"/>
-                      </a:effectRef>
-                      <a:fontRef idx="minor">
-                        <a:schemeClr val="dk1"/>
-                      </a:fontRef>
-                    </wps:style>
-                    <wps:txbx>
-                      <w:txbxContent>
-                        <w:p>
-                          <w:pPr>
-                            <w:pStyle w:val="7"/>
-                          </w:pPr>
-                          <w:r>
-                            <w:fldChar w:fldCharType="begin"/>
-                          </w:r>
-                          <w:r>
-                            <w:instrText xml:space="preserve"> PAGE  \* MERGEFORMAT </w:instrText>
-                          </w:r>
-                          <w:r>
-                            <w:fldChar w:fldCharType="separate"/>
-                          </w:r>
-                          <w:r>
-                            <w:t>2</w:t>
-                          </w:r>
-                          <w:r>
-                            <w:fldChar w:fldCharType="end"/>
-                          </w:r>
-                        </w:p>
-                      </w:txbxContent>
-                    </wps:txbx>
-                    <wps:bodyPr rot="0" spcFirstLastPara="0" vertOverflow="overflow" horzOverflow="overflow" vert="horz" wrap="none" lIns="0" tIns="0" rIns="0" bIns="0" numCol="1" spcCol="0" rtlCol="0" fromWordArt="0" anchor="t" anchorCtr="0" forceAA="0" upright="0" compatLnSpc="1">
-                      <a:spAutoFit/>
-                    </wps:bodyPr>
-                  </wps:wsp>
-                </a:graphicData>
-              </a:graphic>
-            </wp:anchor>
-          </w:drawing>
-        </mc:Choice>
-        <mc:Fallback>
-          <w:pict>
-            <v:shape id="_x0000_s1026" o:spid="_x0000_s1026" o:spt="202" type="#_x0000_t202" style="position:absolute;left:0pt;margin-top:0pt;height:144pt;width:144pt;mso-position-horizontal:right;mso-position-horizontal-relative:margin;mso-wrap-style:none;z-index:251659264;mso-width-relative:page;mso-height-relative:page;" filled="f" stroked="f" coordsize="21600,21600" o:gfxdata="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">
-              <v:fill on="f" focussize="0,0"/>
-              <v:stroke on="f" weight="0.5pt"/>
-              <v:imagedata o:title=""/>
-              <o:lock v:ext="edit" aspectratio="f"/>
-              <v:textbox inset="0mm,0mm,0mm,0mm" style="mso-fit-shape-to-text:t;">
-                <w:txbxContent>
-                  <w:p>
-                    <w:pPr>
-                      <w:pStyle w:val="7"/>
-                    </w:pPr>
-                    <w:r>
-                      <w:fldChar w:fldCharType="begin"/>
-                    </w:r>
-                    <w:r>
-                      <w:instrText xml:space="preserve"> PAGE  \* MERGEFORMAT </w:instrText>
-                    </w:r>
-                    <w:r>
-                      <w:fldChar w:fldCharType="separate"/>
-                    </w:r>
-                    <w:r>
-                      <w:t>2</w:t>
-                    </w:r>
-                    <w:r>
-                      <w:fldChar w:fldCharType="end"/>
-                    </w:r>
-                  </w:p>
-                </w:txbxContent>
-              </v:textbox>
-            </v:shape>
-          </w:pict>
-        </mc:Fallback>
-      </mc:AlternateContent>
-    </w:r>
-    <w:r>
-      <w:rPr>
-        <w:rFonts w:hint="eastAsia" w:ascii="微软雅黑" w:hAnsi="微软雅黑" w:eastAsia="微软雅黑" w:cs="微软雅黑"/>
+        <w:rFonts w:ascii="Segoe UI" w:hAnsi="Segoe UI"/>
         <w:color w:val="808080"/>
         <w:sz w:val="16"/>
       </w:rPr>
-      <w:t>RoC Workflow Windows User Manual · v1.0.1</w:t>
+      <w:t xml:space="preserve">Deeptime RoC Analysis Windows User Manual · v1.0.1 · </w:t>
+    </w:r>
+    <w:r>
+      <w:fldChar w:fldCharType="begin"/>
+    </w:r>
+    <w:r>
+      <w:instrText xml:space="preserve"> PAGE </w:instrText>
+    </w:r>
+    <w:r>
+      <w:fldChar w:fldCharType="separate"/>
+    </w:r>
+    <w:r>
+      <w:t>1</w:t>
+    </w:r>
+    <w:r>
+      <w:fldChar w:fldCharType="end"/>
     </w:r>
   </w:p>
 </w:ftr>
@@ -11561,6 +11506,16 @@
     </w:p>
   </w:footnote>
 </w:footnotes>
+</file>
+
+<file path=word/header1.xml><?xml version="1.0" encoding="utf-8"?>
+<w:hdr xmlns:m="http://schemas.openxmlformats.org/officeDocument/2006/math" xmlns:mc="http://schemas.openxmlformats.org/markup-compatibility/2006" xmlns:mo="http://schemas.microsoft.com/office/mac/office/2008/main" xmlns:mv="urn:schemas-microsoft-com:mac:vml" xmlns:o="urn:schemas-microsoft-com:office:office" xmlns:r="http://schemas.openxmlformats.org/officeDocument/2006/relationships" xmlns:v="urn:schemas-microsoft-com:vml" xmlns:w10="urn:schemas-microsoft-com:office:word" xmlns:w14="http://schemas.microsoft.com/office/word/2010/wordml" xmlns:w="http://schemas.openxmlformats.org/wordprocessingml/2006/main" xmlns:wne="http://schemas.microsoft.com/office/word/2006/wordml" xmlns:wp14="http://schemas.microsoft.com/office/word/2010/wordprocessingDrawing" xmlns:wp="http://schemas.openxmlformats.org/drawingml/2006/wordprocessingDrawing" xmlns:wpc="http://schemas.microsoft.com/office/word/2010/wordprocessingCanvas" xmlns:wpg="http://schemas.microsoft.com/office/word/2010/wordprocessingGroup" xmlns:wpi="http://schemas.microsoft.com/office/word/2010/wordprocessingInk" xmlns:wps="http://schemas.microsoft.com/office/word/2010/wordprocessingShape" mc:Ignorable="w14 wp14">
+  <w:p>
+    <w:pPr>
+      <w:pStyle w:val="Header"/>
+    </w:pPr>
+  </w:p>
+</w:hdr>
 </file>
 
 <file path=word/numbering.xml><?xml version="1.0" encoding="utf-8"?>

</xml_diff>